<commit_message>
Rewrite READMEs and manual
</commit_message>
<xml_diff>
--- a/2_User_Manual/Sentry_User_Manual.docx
+++ b/2_User_Manual/Sentry_User_Manual.docx
@@ -64,7 +64,7 @@
           <w:sz w:val="22"/>
           <w:szCs w:val="22"/>
         </w:rPr>
-        <w:t xml:space="preserve">sshd  •  nginx  •  docker-compose</w:t>
+        <w:t xml:space="preserve">sshd  |  nginx  |  docker-compose</w:t>
       </w:r>
     </w:p>
     <w:p>
@@ -79,7 +79,7 @@
           <w:sz w:val="20"/>
           <w:szCs w:val="20"/>
         </w:rPr>
-        <w:t xml:space="preserve">Course Mini Project — Custom Ethical Hacking Tool</w:t>
+        <w:t xml:space="preserve">Course Mini Project: Custom Ethical Hacking Tool</w:t>
       </w:r>
     </w:p>
     <w:p>
@@ -94,7 +94,7 @@
           <w:sz w:val="20"/>
           <w:szCs w:val="20"/>
         </w:rPr>
-        <w:t xml:space="preserve">Hood Security Department   ·   NSSECU2 (S04)   ·   Version 0.1.0</w:t>
+        <w:t xml:space="preserve">Hood Security Department   .   NSSECU2 (S04)   .   Version 0.1.0</w:t>
       </w:r>
     </w:p>
     <w:p>
@@ -110,7 +110,7 @@
           <w:sz w:val="19"/>
           <w:szCs w:val="19"/>
         </w:rPr>
-        <w:t xml:space="preserve">Static analysis only — this tool never connects to a live system.</w:t>
+        <w:t xml:space="preserve">Static analysis only. This tool never connects to a live system.</w:t>
       </w:r>
     </w:p>
     <w:p>
@@ -157,16 +157,16 @@
           <w:sz w:val="21"/>
           <w:szCs w:val="21"/>
         </w:rPr>
-        <w:t xml:space="preserve">static security configuration linter</w:t>
-      </w:r>
-      <w:r>
-        <w:rPr>
-          <w:rFonts w:ascii="Calibri" w:cs="Calibri" w:eastAsia="Calibri" w:hAnsi="Calibri"/>
-          <w:color w:val="1E293B"/>
-          <w:sz w:val="21"/>
-          <w:szCs w:val="21"/>
-        </w:rPr>
-        <w:t xml:space="preserve">. You point it at a configuration file and it reports insecure settings, insecure defaults, and missing hardening directives, each with a severity, a plain-language explanation, and a suggested fix. It supports three configuration formats through a single engine: OpenSSH server configs (</w:t>
+        <w:t xml:space="preserve">static security config linter</w:t>
+      </w:r>
+      <w:r>
+        <w:rPr>
+          <w:rFonts w:ascii="Calibri" w:cs="Calibri" w:eastAsia="Calibri" w:hAnsi="Calibri"/>
+          <w:color w:val="1E293B"/>
+          <w:sz w:val="21"/>
+          <w:szCs w:val="21"/>
+        </w:rPr>
+        <w:t xml:space="preserve">. You point it at a config file and it tells you what's insecure: bad settings, unsafe defaults, and missing hardening, each with a severity, a short explanation, and a suggested fix. It works on three kinds of files: OpenSSH server configs (</w:t>
       </w:r>
       <w:r>
         <w:rPr>
@@ -234,7 +234,7 @@
           <w:sz w:val="21"/>
           <w:szCs w:val="21"/>
         </w:rPr>
-        <w:t xml:space="preserve">Sentry performs </w:t>
+        <w:t xml:space="preserve">Sentry is </w:t>
       </w:r>
       <w:r>
         <w:rPr>
@@ -254,7 +254,7 @@
           <w:sz w:val="21"/>
           <w:szCs w:val="21"/>
         </w:rPr>
-        <w:t xml:space="preserve">: it reads configuration text and never connects to, scans, probes, or tests any running system, service, or network. This makes it safe to run anywhere, including in a lab or classroom setting.</w:t>
+        <w:t xml:space="preserve">. It reads the config text and never connects to, scans, probes, or tests any running system, service, or network. That makes it safe to run anywhere, including in a lab or classroom.</w:t>
       </w:r>
     </w:p>
     <w:p>
@@ -315,7 +315,7 @@
                 <w:sz w:val="20"/>
                 <w:szCs w:val="20"/>
               </w:rPr>
-              <w:t xml:space="preserve">Requirement</w:t>
+              <w:t xml:space="preserve">What you need</w:t>
             </w:r>
           </w:p>
         </w:tc>
@@ -340,7 +340,7 @@
                 <w:sz w:val="20"/>
                 <w:szCs w:val="20"/>
               </w:rPr>
-              <w:t xml:space="preserve">Detail</w:t>
+              <w:t xml:space="preserve">Details</w:t>
             </w:r>
           </w:p>
         </w:tc>
@@ -388,7 +388,7 @@
                 <w:sz w:val="20"/>
                 <w:szCs w:val="20"/>
               </w:rPr>
-              <w:t xml:space="preserve">Version 3.10 or newer (developed and tested on 3.12)</w:t>
+              <w:t xml:space="preserve">Version 3.10 or newer (we built and tested on 3.12)</w:t>
             </w:r>
           </w:p>
         </w:tc>
@@ -550,7 +550,7 @@
                 <w:sz w:val="20"/>
                 <w:szCs w:val="20"/>
               </w:rPr>
-              <w:t xml:space="preserve">Only needed once, during installation, to download the two dependencies</w:t>
+              <w:t xml:space="preserve">Only needed once, during install, to download the two packages</w:t>
             </w:r>
           </w:p>
         </w:tc>
@@ -598,7 +598,7 @@
                 <w:sz w:val="20"/>
                 <w:szCs w:val="20"/>
               </w:rPr>
-              <w:t xml:space="preserve">Negligible; no administrator or root privileges required</w:t>
+              <w:t xml:space="preserve">Tiny footprint; no administrator or root access needed</w:t>
             </w:r>
           </w:p>
         </w:tc>
@@ -632,7 +632,7 @@
           <w:sz w:val="21"/>
           <w:szCs w:val="21"/>
         </w:rPr>
-        <w:t xml:space="preserve">Unzip the project and open a terminal in the project folder (the folder that contains </w:t>
+        <w:t xml:space="preserve">Unzip the project, then open a terminal in the folder that has </w:t>
       </w:r>
       <w:r>
         <w:rPr>
@@ -650,7 +650,7 @@
           <w:sz w:val="21"/>
           <w:szCs w:val="21"/>
         </w:rPr>
-        <w:t xml:space="preserve">).</w:t>
+        <w:t xml:space="preserve">.</w:t>
       </w:r>
     </w:p>
     <w:p>
@@ -667,7 +667,7 @@
           <w:sz w:val="24"/>
           <w:szCs w:val="24"/>
         </w:rPr>
-        <w:t xml:space="preserve">Option A — recommended (installs the sentry command)</w:t>
+        <w:t xml:space="preserve">Option A: recommended (gives you the sentry command)</w:t>
       </w:r>
     </w:p>
     <w:tbl>
@@ -826,7 +826,7 @@
           <w:sz w:val="24"/>
           <w:szCs w:val="24"/>
         </w:rPr>
-        <w:t xml:space="preserve">Option B — no install, dependencies only</w:t>
+        <w:t xml:space="preserve">Option B: no install, just the dependencies</w:t>
       </w:r>
     </w:p>
     <w:p>
@@ -840,7 +840,7 @@
           <w:sz w:val="21"/>
           <w:szCs w:val="21"/>
         </w:rPr>
-        <w:t xml:space="preserve">Install the two dependencies and run the tool as a Python module. With this option, use </w:t>
+        <w:t xml:space="preserve">Install the two packages and run the tool as a Python module. With this option, write </w:t>
       </w:r>
       <w:r>
         <w:rPr>
@@ -858,7 +858,7 @@
           <w:sz w:val="21"/>
           <w:szCs w:val="21"/>
         </w:rPr>
-        <w:t xml:space="preserve"> wherever this manual writes </w:t>
+        <w:t xml:space="preserve"> wherever this manual says </w:t>
       </w:r>
       <w:r>
         <w:rPr>
@@ -965,7 +965,7 @@
           <w:sz w:val="21"/>
           <w:szCs w:val="21"/>
         </w:rPr>
-        <w:t xml:space="preserve">Windows 11 works the same way, with a few platform notes that prevent the most common problems:</w:t>
+        <w:t xml:space="preserve">Windows works the same way, with a couple of notes that save you the usual headaches:</w:t>
       </w:r>
     </w:p>
     <w:p>
@@ -981,7 +981,7 @@
           <w:sz w:val="21"/>
           <w:szCs w:val="21"/>
         </w:rPr>
-        <w:t xml:space="preserve">Install Python from PATH. </w:t>
+        <w:t xml:space="preserve">Add Python to PATH. </w:t>
       </w:r>
       <w:r>
         <w:rPr>
@@ -1010,7 +1010,7 @@
           <w:sz w:val="21"/>
           <w:szCs w:val="21"/>
         </w:rPr>
-        <w:t xml:space="preserve">. Then close and reopen PowerShell. This prevents the most common “sentry: command not found” and “python is not recognized” errors.</w:t>
+        <w:t xml:space="preserve">. Then close and reopen PowerShell. This is what avoids the “sentry: command not found” and “python is not recognized” errors.</w:t>
       </w:r>
     </w:p>
     <w:p>
@@ -1035,7 +1035,7 @@
           <w:sz w:val="21"/>
           <w:szCs w:val="21"/>
         </w:rPr>
-        <w:t xml:space="preserve">If PowerShell refuses to run </w:t>
+        <w:t xml:space="preserve">If PowerShell won't run </w:t>
       </w:r>
       <w:r>
         <w:rPr>
@@ -1053,7 +1053,7 @@
           <w:sz w:val="21"/>
           <w:szCs w:val="21"/>
         </w:rPr>
-        <w:t xml:space="preserve"> with a message that running scripts is disabled, allow it for your user account only, then run the activate command again:</w:t>
+        <w:t xml:space="preserve"> and says scripts are disabled, allow it for your account, then activate again:</w:t>
       </w:r>
     </w:p>
     <w:tbl>
@@ -1111,7 +1111,7 @@
           <w:sz w:val="21"/>
           <w:szCs w:val="21"/>
         </w:rPr>
-        <w:t xml:space="preserve">Alternatively, skip the virtual environment entirely and use Option B above (</w:t>
+        <w:t xml:space="preserve">Or skip the virtual environment and just use Option B (</w:t>
       </w:r>
       <w:r>
         <w:rPr>
@@ -1129,7 +1129,7 @@
           <w:sz w:val="21"/>
           <w:szCs w:val="21"/>
         </w:rPr>
-        <w:t xml:space="preserve">), which does not require activation.</w:t>
+        <w:t xml:space="preserve">), which doesn't need activation.</w:t>
       </w:r>
     </w:p>
     <w:p>
@@ -1154,27 +1154,7 @@
           <w:sz w:val="21"/>
           <w:szCs w:val="21"/>
         </w:rPr>
-        <w:t xml:space="preserve">Use backslashes in file paths. PowerShell does </w:t>
-      </w:r>
-      <w:r>
-        <w:rPr>
-          <w:rFonts w:ascii="Calibri" w:cs="Calibri" w:eastAsia="Calibri" w:hAnsi="Calibri"/>
-          <w:i/>
-          <w:iCs/>
-          <w:color w:val="1E293B"/>
-          <w:sz w:val="21"/>
-          <w:szCs w:val="21"/>
-        </w:rPr>
-        <w:t xml:space="preserve">not</w:t>
-      </w:r>
-      <w:r>
-        <w:rPr>
-          <w:rFonts w:ascii="Calibri" w:cs="Calibri" w:eastAsia="Calibri" w:hAnsi="Calibri"/>
-          <w:color w:val="1E293B"/>
-          <w:sz w:val="21"/>
-          <w:szCs w:val="21"/>
-        </w:rPr>
-        <w:t xml:space="preserve"> expand a </w:t>
+        <w:t xml:space="preserve">Use backslashes in file paths. PowerShell won't expand a </w:t>
       </w:r>
       <w:r>
         <w:rPr>
@@ -1192,7 +1172,7 @@
           <w:sz w:val="21"/>
           <w:szCs w:val="21"/>
         </w:rPr>
-        <w:t xml:space="preserve"> wildcard, so list files explicitly:</w:t>
+        <w:t xml:space="preserve"> wildcard, so list the files out:</w:t>
       </w:r>
     </w:p>
     <w:tbl>
@@ -1329,7 +1309,7 @@
           <w:sz w:val="21"/>
           <w:szCs w:val="21"/>
         </w:rPr>
-        <w:t xml:space="preserve"> when high-severity findings are present and </w:t>
+        <w:t xml:space="preserve"> when there are high-severity findings and </w:t>
       </w:r>
       <w:r>
         <w:rPr>
@@ -1347,7 +1327,7 @@
           <w:sz w:val="21"/>
           <w:szCs w:val="21"/>
         </w:rPr>
-        <w:t xml:space="preserve"> when clean.</w:t>
+        <w:t xml:space="preserve"> when things are clean.</w:t>
       </w:r>
     </w:p>
     <w:p>
@@ -1363,7 +1343,7 @@
           <w:sz w:val="21"/>
           <w:szCs w:val="21"/>
         </w:rPr>
-        <w:t xml:space="preserve">Colored output. </w:t>
+        <w:t xml:space="preserve">Colors. </w:t>
       </w:r>
       <w:r>
         <w:rPr>
@@ -1392,7 +1372,7 @@
           <w:sz w:val="21"/>
           <w:szCs w:val="21"/>
         </w:rPr>
-        <w:t xml:space="preserve"> (built into Windows 11) for correct colored output. The classic </w:t>
+        <w:t xml:space="preserve"> (it's built into Windows 11) so the colors show up. The old </w:t>
       </w:r>
       <w:r>
         <w:rPr>
@@ -1410,7 +1390,7 @@
           <w:sz w:val="21"/>
           <w:szCs w:val="21"/>
         </w:rPr>
-        <w:t xml:space="preserve"> console may not render colors. To open the HTML report from PowerShell, run </w:t>
+        <w:t xml:space="preserve"> may not render them. To open the HTML report from PowerShell, run </w:t>
       </w:r>
       <w:r>
         <w:rPr>
@@ -1459,7 +1439,7 @@
           <w:sz w:val="21"/>
           <w:szCs w:val="21"/>
         </w:rPr>
-        <w:t xml:space="preserve">Point Sentry at one or more files. It detects the config type from the filename, or you can force it with </w:t>
+        <w:t xml:space="preserve">Point Sentry at one or more files. It figures out the type from the filename, or you can set it with </w:t>
       </w:r>
       <w:r>
         <w:rPr>
@@ -1477,7 +1457,7 @@
           <w:sz w:val="21"/>
           <w:szCs w:val="21"/>
         </w:rPr>
-        <w:t xml:space="preserve">. The examples below use forward slashes; on Windows PowerShell use backslashes (see section 3).</w:t>
+        <w:t xml:space="preserve">. The examples below use forward slashes; on Windows PowerShell, use backslashes (see section 3).</w:t>
       </w:r>
     </w:p>
     <w:p>
@@ -1535,7 +1515,7 @@
                 <w:sz w:val="18"/>
                 <w:szCs w:val="18"/>
               </w:rPr>
-              <w:t xml:space="preserve"># Scan a single file (type auto-detected)</w:t>
+              <w:t xml:space="preserve"># Scan a single file (type detected from the name)</w:t>
             </w:r>
           </w:p>
           <w:p>
@@ -1577,7 +1557,7 @@
                 <w:sz w:val="18"/>
                 <w:szCs w:val="18"/>
               </w:rPr>
-              <w:t xml:space="preserve"># Scan several files of mixed types at once</w:t>
+              <w:t xml:space="preserve"># Scan several files of different types at once</w:t>
             </w:r>
           </w:p>
           <w:p>
@@ -1661,7 +1641,7 @@
                 <w:sz w:val="18"/>
                 <w:szCs w:val="18"/>
               </w:rPr>
-              <w:t xml:space="preserve"># Produce a shareable HTML report</w:t>
+              <w:t xml:space="preserve"># Make a shareable HTML report</w:t>
             </w:r>
           </w:p>
           <w:p>
@@ -1703,7 +1683,7 @@
                 <w:sz w:val="18"/>
                 <w:szCs w:val="18"/>
               </w:rPr>
-              <w:t xml:space="preserve"># List every bundled rule</w:t>
+              <w:t xml:space="preserve"># List every rule</w:t>
             </w:r>
           </w:p>
           <w:p>
@@ -1806,7 +1786,7 @@
                 <w:sz w:val="20"/>
                 <w:szCs w:val="20"/>
               </w:rPr>
-              <w:t xml:space="preserve">Purpose</w:t>
+              <w:t xml:space="preserve">What it does</w:t>
             </w:r>
           </w:p>
         </w:tc>
@@ -2046,7 +2026,7 @@
                 <w:sz w:val="20"/>
                 <w:szCs w:val="20"/>
               </w:rPr>
-              <w:t xml:space="preserve">Exit with code 1 if any finding is at or above this severity (default: high)</w:t>
+              <w:t xml:space="preserve">Exit non-zero if any finding is at or above this severity (default: high)</w:t>
             </w:r>
           </w:p>
         </w:tc>
@@ -2176,7 +2156,7 @@
           <w:sz w:val="21"/>
           <w:szCs w:val="21"/>
         </w:rPr>
-        <w:t xml:space="preserve">Sentry sets its exit code so it can be used unattended in a CI pipeline:</w:t>
+        <w:t xml:space="preserve">Sentry sets its exit code so it can run on its own in a CI pipeline:</w:t>
       </w:r>
     </w:p>
     <w:tbl>
@@ -2341,7 +2321,7 @@
                 <w:sz w:val="20"/>
                 <w:szCs w:val="20"/>
               </w:rPr>
-              <w:t xml:space="preserve">Findings at or above the threshold were reported</w:t>
+              <w:t xml:space="preserve">Findings at or above the threshold</w:t>
             </w:r>
           </w:p>
         </w:tc>
@@ -2389,7 +2369,7 @@
                 <w:sz w:val="20"/>
                 <w:szCs w:val="20"/>
               </w:rPr>
-              <w:t xml:space="preserve">Usage or input error (missing file, unknown type, etc.)</w:t>
+              <w:t xml:space="preserve">Usage or input error (missing file, unknown type, and so on)</w:t>
             </w:r>
           </w:p>
         </w:tc>
@@ -2483,7 +2463,7 @@
           <w:sz w:val="21"/>
           <w:szCs w:val="21"/>
         </w:rPr>
-        <w:t xml:space="preserve"> saying what was found and where, and a </w:t>
+        <w:t xml:space="preserve"> that says what was found and where, and a </w:t>
       </w:r>
       <w:r>
         <w:rPr>
@@ -2503,7 +2483,7 @@
           <w:sz w:val="21"/>
           <w:szCs w:val="21"/>
         </w:rPr>
-        <w:t xml:space="preserve">. A reference to a recognised benchmark (CIS, OWASP, Mozilla) is included where applicable.</w:t>
+        <w:t xml:space="preserve">. Where it applies, it also points to a known benchmark (CIS, OWASP, or Mozilla).</w:t>
       </w:r>
     </w:p>
     <w:p>
@@ -2589,7 +2569,7 @@
                 <w:sz w:val="20"/>
                 <w:szCs w:val="20"/>
               </w:rPr>
-              <w:t xml:space="preserve">Meaning</w:t>
+              <w:t xml:space="preserve">What it means</w:t>
             </w:r>
           </w:p>
         </w:tc>
@@ -2639,7 +2619,7 @@
                 <w:sz w:val="20"/>
                 <w:szCs w:val="20"/>
               </w:rPr>
-              <w:t xml:space="preserve">Serious weakness that should be fixed before deployment</w:t>
+              <w:t xml:space="preserve">A serious weakness. Fix it before you deploy.</w:t>
             </w:r>
           </w:p>
         </w:tc>
@@ -2689,7 +2669,7 @@
                 <w:sz w:val="20"/>
                 <w:szCs w:val="20"/>
               </w:rPr>
-              <w:t xml:space="preserve">Meaningful weakness worth addressing</w:t>
+              <w:t xml:space="preserve">A real weakness worth fixing.</w:t>
             </w:r>
           </w:p>
         </w:tc>
@@ -2739,7 +2719,7 @@
                 <w:sz w:val="20"/>
                 <w:szCs w:val="20"/>
               </w:rPr>
-              <w:t xml:space="preserve">Minor hardening improvement or defence-in-depth</w:t>
+              <w:t xml:space="preserve">A small hardening improvement or defense in depth.</w:t>
             </w:r>
           </w:p>
         </w:tc>
@@ -2789,7 +2769,7 @@
                 <w:sz w:val="20"/>
                 <w:szCs w:val="20"/>
               </w:rPr>
-              <w:t xml:space="preserve">Informational note, no direct risk</w:t>
+              <w:t xml:space="preserve">Just a note, no direct risk.</w:t>
             </w:r>
           </w:p>
         </w:tc>
@@ -2806,7 +2786,7 @@
           <w:sz w:val="21"/>
           <w:szCs w:val="21"/>
         </w:rPr>
-        <w:t xml:space="preserve">Note that a </w:t>
+        <w:t xml:space="preserve">One thing to know: a </w:t>
       </w:r>
       <w:r>
         <w:rPr>
@@ -2826,7 +2806,7 @@
           <w:sz w:val="21"/>
           <w:szCs w:val="21"/>
         </w:rPr>
-        <w:t xml:space="preserve"> hardening directive is reported as a finding in its own right, because relying on an insecure default is itself a security problem.</w:t>
+        <w:t xml:space="preserve"> hardening setting counts as a finding on its own, because relying on an unsafe default is itself a risk.</w:t>
       </w:r>
     </w:p>
     <w:p>
@@ -2857,7 +2837,7 @@
           <w:sz w:val="21"/>
           <w:szCs w:val="21"/>
         </w:rPr>
-        <w:t xml:space="preserve">Scanning the deliberately-weak nginx sample produces the following report. Nine issues are found and grouped by severity, each with the exact line, an explanation, and a fix:</w:t>
+        <w:t xml:space="preserve">Here's what a scan of the weak nginx sample looks like. It finds nine issues, groups them by severity, and shows the exact line, an explanation, and a fix for each one:</w:t>
       </w:r>
     </w:p>
     <w:p>
@@ -2920,7 +2900,7 @@
           <w:sz w:val="17"/>
           <w:szCs w:val="17"/>
         </w:rPr>
-        <w:t xml:space="preserve">Figure 1 — Console output for  sentry samples/nginx.conf.bad</w:t>
+        <w:t xml:space="preserve">Figure 1. Console output for  sentry samples/nginx.conf.bad</w:t>
       </w:r>
     </w:p>
     <w:p>
@@ -2934,7 +2914,7 @@
           <w:sz w:val="21"/>
           <w:szCs w:val="21"/>
         </w:rPr>
-        <w:t xml:space="preserve">The same scan can be written to a self-contained HTML report with </w:t>
+        <w:t xml:space="preserve">You can also write the same scan to a self-contained HTML report with </w:t>
       </w:r>
       <w:r>
         <w:rPr>
@@ -2952,7 +2932,7 @@
           <w:sz w:val="21"/>
           <w:szCs w:val="21"/>
         </w:rPr>
-        <w:t xml:space="preserve">, which opens in any web browser and is useful for sharing or including in a report.</w:t>
+        <w:t xml:space="preserve">. It opens in any browser and is handy for sharing or dropping into a report.</w:t>
       </w:r>
     </w:p>
     <w:p>
@@ -2983,7 +2963,7 @@
           <w:sz w:val="21"/>
           <w:szCs w:val="21"/>
         </w:rPr>
-        <w:t xml:space="preserve">Sentry normalises all three config formats into one common shape and evaluates them with a single, generic rule engine. All security knowledge lives as data in YAML rulesets, so adding a check does not require changing the engine code.</w:t>
+        <w:t xml:space="preserve">Sentry turns all three config formats into one common shape, then checks them with a single, generic rule engine. All the security knowledge lives as data in YAML rulesets, so adding a check doesn't mean changing the engine code.</w:t>
       </w:r>
     </w:p>
     <w:p>
@@ -3046,7 +3026,7 @@
           <w:sz w:val="17"/>
           <w:szCs w:val="17"/>
         </w:rPr>
-        <w:t xml:space="preserve">Figure 2 — Processing pipeline</w:t>
+        <w:t xml:space="preserve">Figure 2. Processing pipeline</w:t>
       </w:r>
     </w:p>
     <w:p>
@@ -3107,7 +3087,7 @@
                 <w:sz w:val="20"/>
                 <w:szCs w:val="20"/>
               </w:rPr>
-              <w:t xml:space="preserve">Symptom</w:t>
+              <w:t xml:space="preserve">Problem</w:t>
             </w:r>
           </w:p>
         </w:tc>
@@ -3132,7 +3112,7 @@
                 <w:sz w:val="20"/>
                 <w:szCs w:val="20"/>
               </w:rPr>
-              <w:t xml:space="preserve">Resolution</w:t>
+              <w:t xml:space="preserve">Fix</w:t>
             </w:r>
           </w:p>
         </w:tc>
@@ -3180,7 +3160,7 @@
                 <w:sz w:val="20"/>
                 <w:szCs w:val="20"/>
               </w:rPr>
-              <w:t xml:space="preserve">Use Option A (pip install -e .) so the command is created, or run python -m sentry instead.</w:t>
+              <w:t xml:space="preserve">Use Option A (pip install -e .) to create the command, or just run python -m sentry.</w:t>
             </w:r>
           </w:p>
         </w:tc>
@@ -3228,7 +3208,7 @@
                 <w:sz w:val="20"/>
                 <w:szCs w:val="20"/>
               </w:rPr>
-              <w:t xml:space="preserve">Python is not on PATH. Reinstall Python and tick “Add python.exe to PATH”, then reopen PowerShell.</w:t>
+              <w:t xml:space="preserve">Python isn't on PATH. Reinstall it and tick “Add python.exe to PATH”, then reopen PowerShell.</w:t>
             </w:r>
           </w:p>
         </w:tc>
@@ -3324,7 +3304,7 @@
                 <w:sz w:val="20"/>
                 <w:szCs w:val="20"/>
               </w:rPr>
-              <w:t xml:space="preserve">The filename was not recognised. Add --type sshd | nginx | docker-compose.</w:t>
+              <w:t xml:space="preserve">The filename wasn't recognized. Add --type sshd | nginx | docker-compose.</w:t>
             </w:r>
           </w:p>
         </w:tc>
@@ -3372,7 +3352,7 @@
                 <w:sz w:val="20"/>
                 <w:szCs w:val="20"/>
               </w:rPr>
-              <w:t xml:space="preserve">Dependencies are not installed. Run pip install -r requirements.txt.</w:t>
+              <w:t xml:space="preserve">The dependencies aren't installed. Run pip install -r requirements.txt.</w:t>
             </w:r>
           </w:p>
         </w:tc>
@@ -3397,7 +3377,7 @@
                 <w:sz w:val="20"/>
                 <w:szCs w:val="20"/>
               </w:rPr>
-              <w:t xml:space="preserve">No colour in the output</w:t>
+              <w:t xml:space="preserve">No color in the output</w:t>
             </w:r>
           </w:p>
         </w:tc>
@@ -3420,7 +3400,7 @@
                 <w:sz w:val="20"/>
                 <w:szCs w:val="20"/>
               </w:rPr>
-              <w:t xml:space="preserve">Expected when output is piped; on Windows, use Windows Terminal rather than cmd.exe.</w:t>
+              <w:t xml:space="preserve">Normal when output is piped. On Windows, use Windows Terminal instead of cmd.exe.</w:t>
             </w:r>
           </w:p>
         </w:tc>
@@ -3454,7 +3434,7 @@
           <w:sz w:val="21"/>
           <w:szCs w:val="21"/>
         </w:rPr>
-        <w:t xml:space="preserve">Sentry is a deliberately small, educational tool and is not a replacement for mature scanners. It ships with roughly 29 rules across three formats; it does not have CVE or version-vulnerability awareness; its nginx parsing is directive-level rather than fully block-scoped; its secret detection is pattern-based and may miss unusually named secrets; and findings for docker-compose files do not carry line numbers.</w:t>
+        <w:t xml:space="preserve">Sentry is a small, educational tool on purpose, and it isn't a replacement for a mature scanner. It ships with about 29 rules across three formats. It has no CVE or version-vulnerability checks. Its nginx parsing is directive-level rather than fully block-scoped. Its secret detection is pattern-based, so it can miss oddly named secrets. And findings for docker-compose files don't carry line numbers.</w:t>
       </w:r>
     </w:p>
     <w:p>
@@ -3525,7 +3505,7 @@
                 <w:sz w:val="20"/>
                 <w:szCs w:val="20"/>
               </w:rPr>
-              <w:t xml:space="preserve">Sentry performs static analysis of configuration text you provide. It does not connect to, scan, or test any live system. You are responsible for ensuring you have permission to review any file you run it against.</w:t>
+              <w:t xml:space="preserve">Sentry only does static analysis of config text you give it. It doesn't connect to, scan, or test any live system. Make sure you have permission to review any file you run it against.</w:t>
             </w:r>
           </w:p>
         </w:tc>

</xml_diff>